<commit_message>
updated some questions and review screen
</commit_message>
<xml_diff>
--- a/docassemble/VTSmallClaimsComplaint/data/templates/VT_small_claims_complaint_addendum.docx
+++ b/docassemble/VTSmallClaimsComplaint/data/templates/VT_small_claims_complaint_addendum.docx
@@ -35,359 +35,298 @@
         </w:rPr>
         <w:t>Small Claims Complaint</w:t>
       </w:r>
+      <w:r>
+        <w:rPr>
+          <w:sz w:val="26"/>
+          <w:szCs w:val="26"/>
+        </w:rPr>
+        <w:br/>
+      </w:r>
+      <w:r>
+        <w:rPr>
+          <w:sz w:val="26"/>
+          <w:szCs w:val="26"/>
+        </w:rPr>
+        <w:t>Civil</w:t>
+      </w:r>
+      <w:r>
+        <w:rPr>
+          <w:sz w:val="26"/>
+          <w:szCs w:val="26"/>
+        </w:rPr>
+        <w:t xml:space="preserve"> Division</w:t>
+      </w:r>
+      <w:r>
+        <w:rPr>
+          <w:sz w:val="26"/>
+          <w:szCs w:val="26"/>
+        </w:rPr>
+        <w:t>,</w:t>
+      </w:r>
+      <w:r>
+        <w:rPr>
+          <w:sz w:val="26"/>
+          <w:szCs w:val="26"/>
+        </w:rPr>
+        <w:t xml:space="preserve"> </w:t>
+      </w:r>
+      <w:r>
+        <w:rPr>
+          <w:sz w:val="26"/>
+          <w:szCs w:val="26"/>
+        </w:rPr>
+        <w:t xml:space="preserve">{{ </w:t>
+      </w:r>
+      <w:proofErr w:type="spellStart"/>
+      <w:r>
+        <w:rPr>
+          <w:sz w:val="26"/>
+          <w:szCs w:val="26"/>
+        </w:rPr>
+        <w:t>user_selected_county</w:t>
+      </w:r>
+      <w:proofErr w:type="spellEnd"/>
+      <w:r>
+        <w:rPr>
+          <w:sz w:val="26"/>
+          <w:szCs w:val="26"/>
+        </w:rPr>
+        <w:t>}}</w:t>
+      </w:r>
+      <w:r>
+        <w:rPr>
+          <w:sz w:val="26"/>
+          <w:szCs w:val="26"/>
+        </w:rPr>
+        <w:t xml:space="preserve"> Unit</w:t>
+      </w:r>
+      <w:r>
+        <w:rPr>
+          <w:sz w:val="26"/>
+          <w:szCs w:val="26"/>
+        </w:rPr>
+        <w:br/>
+      </w:r>
+      <w:r>
+        <w:rPr>
+          <w:sz w:val="26"/>
+          <w:szCs w:val="26"/>
+        </w:rPr>
+        <w:t xml:space="preserve">{{ </w:t>
+      </w:r>
+      <w:r>
+        <w:rPr>
+          <w:sz w:val="26"/>
+          <w:szCs w:val="26"/>
+        </w:rPr>
+        <w:t>users[0]</w:t>
+      </w:r>
+      <w:r>
+        <w:rPr>
+          <w:sz w:val="26"/>
+          <w:szCs w:val="26"/>
+        </w:rPr>
+        <w:t xml:space="preserve"> }}</w:t>
+      </w:r>
+      <w:r>
+        <w:rPr>
+          <w:sz w:val="26"/>
+          <w:szCs w:val="26"/>
+        </w:rPr>
+        <w:t xml:space="preserve"> v. </w:t>
+      </w:r>
+      <w:r>
+        <w:rPr>
+          <w:sz w:val="26"/>
+          <w:szCs w:val="26"/>
+        </w:rPr>
+        <w:t>{</w:t>
+      </w:r>
+      <w:r>
+        <w:rPr>
+          <w:sz w:val="26"/>
+          <w:szCs w:val="26"/>
+        </w:rPr>
+        <w:t xml:space="preserve">{ </w:t>
+      </w:r>
+      <w:proofErr w:type="spellStart"/>
+      <w:r>
+        <w:rPr>
+          <w:sz w:val="26"/>
+          <w:szCs w:val="26"/>
+        </w:rPr>
+        <w:t>other_parties.short_list</w:t>
+      </w:r>
+      <w:proofErr w:type="spellEnd"/>
+      <w:r>
+        <w:rPr>
+          <w:sz w:val="26"/>
+          <w:szCs w:val="26"/>
+        </w:rPr>
+        <w:t>(</w:t>
+      </w:r>
+      <w:r>
+        <w:rPr>
+          <w:sz w:val="26"/>
+          <w:szCs w:val="26"/>
+        </w:rPr>
+        <w:t>1</w:t>
+      </w:r>
+      <w:r>
+        <w:rPr>
+          <w:sz w:val="26"/>
+          <w:szCs w:val="26"/>
+        </w:rPr>
+        <w:t xml:space="preserve">) </w:t>
+      </w:r>
+      <w:r>
+        <w:rPr>
+          <w:sz w:val="26"/>
+          <w:szCs w:val="26"/>
+        </w:rPr>
+        <w:t>}</w:t>
+      </w:r>
+      <w:r>
+        <w:rPr>
+          <w:sz w:val="26"/>
+          <w:szCs w:val="26"/>
+        </w:rPr>
+        <w:t>}</w:t>
+      </w:r>
     </w:p>
     <w:p>
       <w:pPr>
-        <w:pStyle w:val="Heading2"/>
-        <w:rPr>
-          <w:sz w:val="26"/>
-          <w:szCs w:val="26"/>
-        </w:rPr>
-      </w:pPr>
-      <w:r>
-        <w:rPr>
-          <w:sz w:val="26"/>
-          <w:szCs w:val="26"/>
-        </w:rPr>
-        <w:t>Civil</w:t>
-      </w:r>
-      <w:r>
-        <w:rPr>
-          <w:sz w:val="26"/>
-          <w:szCs w:val="26"/>
-        </w:rPr>
-        <w:t xml:space="preserve"> Division</w:t>
-      </w:r>
-      <w:r>
-        <w:rPr>
-          <w:sz w:val="26"/>
-          <w:szCs w:val="26"/>
-        </w:rPr>
-        <w:t>,</w:t>
-      </w:r>
-      <w:r>
-        <w:rPr>
-          <w:sz w:val="26"/>
-          <w:szCs w:val="26"/>
-        </w:rPr>
-        <w:t xml:space="preserve"> </w:t>
-      </w:r>
-      <w:proofErr w:type="gramStart"/>
-      <w:r>
-        <w:rPr>
-          <w:sz w:val="26"/>
-          <w:szCs w:val="26"/>
-        </w:rPr>
-        <w:t xml:space="preserve">{{ </w:t>
-      </w:r>
-      <w:proofErr w:type="spellStart"/>
-      <w:r>
-        <w:rPr>
-          <w:sz w:val="26"/>
-          <w:szCs w:val="26"/>
-        </w:rPr>
-        <w:t>user</w:t>
-      </w:r>
-      <w:proofErr w:type="gramEnd"/>
-      <w:r>
-        <w:rPr>
-          <w:sz w:val="26"/>
-          <w:szCs w:val="26"/>
-        </w:rPr>
-        <w:t>_selected_county</w:t>
-      </w:r>
-      <w:proofErr w:type="spellEnd"/>
-      <w:r>
-        <w:rPr>
-          <w:sz w:val="26"/>
-          <w:szCs w:val="26"/>
-        </w:rPr>
-        <w:t>}}</w:t>
-      </w:r>
-      <w:r>
-        <w:rPr>
-          <w:sz w:val="26"/>
-          <w:szCs w:val="26"/>
-        </w:rPr>
-        <w:t xml:space="preserve"> Unit</w:t>
-      </w:r>
+        <w:rPr>
+          <w:rFonts w:ascii="Arial" w:hAnsi="Arial" w:cs="Arial"/>
+          <w:sz w:val="28"/>
+          <w:szCs w:val="28"/>
+        </w:rPr>
+      </w:pPr>
     </w:p>
     <w:p>
       <w:pPr>
-        <w:pStyle w:val="Heading2"/>
-        <w:spacing w:before="0"/>
-        <w:rPr>
-          <w:sz w:val="26"/>
-          <w:szCs w:val="26"/>
-        </w:rPr>
-      </w:pPr>
-      <w:proofErr w:type="gramStart"/>
-      <w:r>
-        <w:rPr>
-          <w:sz w:val="26"/>
-          <w:szCs w:val="26"/>
-        </w:rPr>
-        <w:t xml:space="preserve">{{ </w:t>
-      </w:r>
-      <w:r>
-        <w:rPr>
-          <w:sz w:val="26"/>
-          <w:szCs w:val="26"/>
-        </w:rPr>
-        <w:t>users</w:t>
-      </w:r>
-      <w:proofErr w:type="gramEnd"/>
-      <w:r>
-        <w:rPr>
-          <w:sz w:val="26"/>
-          <w:szCs w:val="26"/>
-        </w:rPr>
-        <w:t>[0]</w:t>
-      </w:r>
-      <w:r>
-        <w:rPr>
-          <w:sz w:val="26"/>
-          <w:szCs w:val="26"/>
-        </w:rPr>
-        <w:t xml:space="preserve"> }}</w:t>
-      </w:r>
-      <w:r>
-        <w:rPr>
-          <w:sz w:val="26"/>
-          <w:szCs w:val="26"/>
-        </w:rPr>
-        <w:t xml:space="preserve"> v. </w:t>
-      </w:r>
-      <w:r>
-        <w:rPr>
-          <w:sz w:val="26"/>
-          <w:szCs w:val="26"/>
-        </w:rPr>
-        <w:t>{</w:t>
-      </w:r>
-      <w:r>
-        <w:rPr>
-          <w:sz w:val="26"/>
-          <w:szCs w:val="26"/>
-        </w:rPr>
-        <w:t xml:space="preserve">{ </w:t>
+        <w:rPr>
+          <w:rFonts w:ascii="Arial" w:hAnsi="Arial" w:cs="Arial"/>
+          <w:sz w:val="24"/>
+          <w:szCs w:val="24"/>
+        </w:rPr>
+      </w:pPr>
+      <w:r>
+        <w:rPr>
+          <w:rFonts w:ascii="Arial" w:hAnsi="Arial" w:cs="Arial"/>
+          <w:sz w:val="24"/>
+          <w:szCs w:val="24"/>
+        </w:rPr>
+        <w:t xml:space="preserve">{%p for field in </w:t>
       </w:r>
       <w:proofErr w:type="spellStart"/>
       <w:r>
         <w:rPr>
-          <w:sz w:val="26"/>
-          <w:szCs w:val="26"/>
-        </w:rPr>
-        <w:t>other_parties.short_list</w:t>
+          <w:rFonts w:ascii="Arial" w:hAnsi="Arial" w:cs="Arial"/>
+          <w:sz w:val="24"/>
+          <w:szCs w:val="24"/>
+        </w:rPr>
+        <w:t>VT_small_claims_complaint_</w:t>
+      </w:r>
+      <w:r>
+        <w:rPr>
+          <w:rFonts w:ascii="Arial" w:hAnsi="Arial" w:cs="Arial"/>
+          <w:sz w:val="24"/>
+          <w:szCs w:val="24"/>
+        </w:rPr>
+        <w:t>attachment</w:t>
+      </w:r>
+      <w:r>
+        <w:rPr>
+          <w:rFonts w:ascii="Arial" w:hAnsi="Arial" w:cs="Arial"/>
+          <w:sz w:val="24"/>
+          <w:szCs w:val="24"/>
+        </w:rPr>
+        <w:t>.overflow</w:t>
       </w:r>
       <w:proofErr w:type="spellEnd"/>
       <w:r>
         <w:rPr>
-          <w:sz w:val="26"/>
-          <w:szCs w:val="26"/>
-        </w:rPr>
-        <w:t>(</w:t>
-      </w:r>
-      <w:r>
-        <w:rPr>
-          <w:sz w:val="26"/>
-          <w:szCs w:val="26"/>
-        </w:rPr>
-        <w:t>1</w:t>
-      </w:r>
-      <w:r>
-        <w:rPr>
-          <w:sz w:val="26"/>
-          <w:szCs w:val="26"/>
-        </w:rPr>
-        <w:t xml:space="preserve">) </w:t>
-      </w:r>
-      <w:r>
-        <w:rPr>
-          <w:sz w:val="26"/>
-          <w:szCs w:val="26"/>
-        </w:rPr>
-        <w:t>}</w:t>
-      </w:r>
-      <w:r>
-        <w:rPr>
-          <w:sz w:val="26"/>
-          <w:szCs w:val="26"/>
-        </w:rPr>
-        <w:t>}</w:t>
+          <w:rFonts w:ascii="Arial" w:hAnsi="Arial" w:cs="Arial"/>
+          <w:sz w:val="24"/>
+          <w:szCs w:val="24"/>
+        </w:rPr>
+        <w:t>() %}</w:t>
       </w:r>
     </w:p>
     <w:p>
       <w:pPr>
         <w:rPr>
           <w:rFonts w:ascii="Arial" w:hAnsi="Arial" w:cs="Arial"/>
-          <w:sz w:val="28"/>
-          <w:szCs w:val="28"/>
-        </w:rPr>
-      </w:pPr>
+          <w:sz w:val="24"/>
+          <w:szCs w:val="24"/>
+        </w:rPr>
+      </w:pPr>
+      <w:r>
+        <w:rPr>
+          <w:rFonts w:ascii="Arial" w:hAnsi="Arial" w:cs="Arial"/>
+          <w:sz w:val="24"/>
+          <w:szCs w:val="24"/>
+        </w:rPr>
+        <w:t xml:space="preserve">{%p if </w:t>
+      </w:r>
+      <w:proofErr w:type="spellStart"/>
+      <w:r>
+        <w:rPr>
+          <w:rFonts w:ascii="Arial" w:hAnsi="Arial" w:cs="Arial"/>
+          <w:sz w:val="24"/>
+          <w:szCs w:val="24"/>
+        </w:rPr>
+        <w:t>field.is_object_list</w:t>
+      </w:r>
+      <w:proofErr w:type="spellEnd"/>
+      <w:r>
+        <w:rPr>
+          <w:rFonts w:ascii="Arial" w:hAnsi="Arial" w:cs="Arial"/>
+          <w:sz w:val="24"/>
+          <w:szCs w:val="24"/>
+        </w:rPr>
+        <w:t>()</w:t>
+      </w:r>
+      <w:r>
+        <w:rPr>
+          <w:rFonts w:ascii="Arial" w:hAnsi="Arial" w:cs="Arial"/>
+          <w:sz w:val="24"/>
+          <w:szCs w:val="24"/>
+        </w:rPr>
+        <w:t xml:space="preserve"> </w:t>
+      </w:r>
+      <w:r>
+        <w:rPr>
+          <w:rFonts w:ascii="Arial" w:hAnsi="Arial" w:cs="Arial"/>
+          <w:sz w:val="24"/>
+          <w:szCs w:val="24"/>
+        </w:rPr>
+        <w:t xml:space="preserve">%} </w:t>
+      </w:r>
     </w:p>
     <w:p>
       <w:pPr>
-        <w:rPr>
-          <w:rFonts w:ascii="Arial" w:hAnsi="Arial" w:cs="Arial"/>
-          <w:sz w:val="24"/>
-          <w:szCs w:val="24"/>
-        </w:rPr>
-      </w:pPr>
-      <w:r>
-        <w:rPr>
-          <w:rFonts w:ascii="Arial" w:hAnsi="Arial" w:cs="Arial"/>
-          <w:sz w:val="24"/>
-          <w:szCs w:val="24"/>
-        </w:rPr>
-        <w:t xml:space="preserve">{%p for field in </w:t>
+        <w:pStyle w:val="Heading3"/>
+        <w:rPr>
+          <w:sz w:val="24"/>
+          <w:szCs w:val="24"/>
+        </w:rPr>
+      </w:pPr>
+      <w:r>
+        <w:rPr>
+          <w:sz w:val="24"/>
+          <w:szCs w:val="24"/>
+        </w:rPr>
+        <w:t xml:space="preserve">{{ </w:t>
       </w:r>
       <w:proofErr w:type="spellStart"/>
       <w:r>
         <w:rPr>
-          <w:rFonts w:ascii="Arial" w:hAnsi="Arial" w:cs="Arial"/>
-          <w:sz w:val="24"/>
-          <w:szCs w:val="24"/>
-        </w:rPr>
-        <w:t>VT_small_claims_complaint_</w:t>
-      </w:r>
-      <w:proofErr w:type="gramStart"/>
-      <w:r>
-        <w:rPr>
-          <w:rFonts w:ascii="Arial" w:hAnsi="Arial" w:cs="Arial"/>
-          <w:sz w:val="24"/>
-          <w:szCs w:val="24"/>
-        </w:rPr>
-        <w:t>attachment</w:t>
-      </w:r>
-      <w:r>
-        <w:rPr>
-          <w:rFonts w:ascii="Arial" w:hAnsi="Arial" w:cs="Arial"/>
-          <w:sz w:val="24"/>
-          <w:szCs w:val="24"/>
-        </w:rPr>
-        <w:t>.overflow</w:t>
-      </w:r>
-      <w:proofErr w:type="spellEnd"/>
-      <w:proofErr w:type="gramEnd"/>
-      <w:r>
-        <w:rPr>
-          <w:rFonts w:ascii="Arial" w:hAnsi="Arial" w:cs="Arial"/>
-          <w:sz w:val="24"/>
-          <w:szCs w:val="24"/>
-        </w:rPr>
-        <w:t>() %}</w:t>
-      </w:r>
-    </w:p>
-    <w:p>
-      <w:pPr>
-        <w:rPr>
-          <w:rFonts w:ascii="Arial" w:hAnsi="Arial" w:cs="Arial"/>
-          <w:sz w:val="24"/>
-          <w:szCs w:val="24"/>
-        </w:rPr>
-      </w:pPr>
-    </w:p>
-    <w:p>
-      <w:pPr>
-        <w:rPr>
-          <w:rFonts w:ascii="Arial" w:hAnsi="Arial" w:cs="Arial"/>
-          <w:sz w:val="24"/>
-          <w:szCs w:val="24"/>
-        </w:rPr>
-      </w:pPr>
-      <w:r>
-        <w:rPr>
-          <w:rFonts w:ascii="Arial" w:hAnsi="Arial" w:cs="Arial"/>
-          <w:sz w:val="24"/>
-          <w:szCs w:val="24"/>
-        </w:rPr>
-        <w:t xml:space="preserve">{%p if </w:t>
-      </w:r>
-      <w:proofErr w:type="spellStart"/>
-      <w:r>
-        <w:rPr>
-          <w:rFonts w:ascii="Arial" w:hAnsi="Arial" w:cs="Arial"/>
-          <w:sz w:val="24"/>
-          <w:szCs w:val="24"/>
-        </w:rPr>
-        <w:t>field.is_object_</w:t>
-      </w:r>
-      <w:proofErr w:type="gramStart"/>
-      <w:r>
-        <w:rPr>
-          <w:rFonts w:ascii="Arial" w:hAnsi="Arial" w:cs="Arial"/>
-          <w:sz w:val="24"/>
-          <w:szCs w:val="24"/>
-        </w:rPr>
-        <w:t>list</w:t>
-      </w:r>
-      <w:proofErr w:type="spellEnd"/>
-      <w:r>
-        <w:rPr>
-          <w:rFonts w:ascii="Arial" w:hAnsi="Arial" w:cs="Arial"/>
-          <w:sz w:val="24"/>
-          <w:szCs w:val="24"/>
-        </w:rPr>
-        <w:t>(</w:t>
-      </w:r>
-      <w:proofErr w:type="gramEnd"/>
-      <w:r>
-        <w:rPr>
-          <w:rFonts w:ascii="Arial" w:hAnsi="Arial" w:cs="Arial"/>
-          <w:sz w:val="24"/>
-          <w:szCs w:val="24"/>
-        </w:rPr>
-        <w:t>)</w:t>
-      </w:r>
-      <w:r>
-        <w:rPr>
-          <w:rFonts w:ascii="Arial" w:hAnsi="Arial" w:cs="Arial"/>
-          <w:sz w:val="24"/>
-          <w:szCs w:val="24"/>
-        </w:rPr>
-        <w:t xml:space="preserve"> </w:t>
-      </w:r>
-      <w:r>
-        <w:rPr>
-          <w:rFonts w:ascii="Arial" w:hAnsi="Arial" w:cs="Arial"/>
-          <w:sz w:val="24"/>
-          <w:szCs w:val="24"/>
-        </w:rPr>
-        <w:t xml:space="preserve">%} </w:t>
-      </w:r>
-    </w:p>
-    <w:p>
-      <w:pPr>
-        <w:pStyle w:val="Heading3"/>
-        <w:rPr>
-          <w:sz w:val="24"/>
-          <w:szCs w:val="24"/>
-        </w:rPr>
-      </w:pPr>
-      <w:proofErr w:type="gramStart"/>
-      <w:r>
-        <w:rPr>
-          <w:sz w:val="24"/>
-          <w:szCs w:val="24"/>
-        </w:rPr>
-        <w:t xml:space="preserve">{{ </w:t>
-      </w:r>
-      <w:proofErr w:type="spellStart"/>
-      <w:r>
-        <w:rPr>
-          <w:sz w:val="24"/>
-          <w:szCs w:val="24"/>
-        </w:rPr>
-        <w:t>field</w:t>
-      </w:r>
-      <w:proofErr w:type="gramEnd"/>
-      <w:r>
-        <w:rPr>
-          <w:sz w:val="24"/>
-          <w:szCs w:val="24"/>
-        </w:rPr>
-        <w:t>.label</w:t>
+          <w:sz w:val="24"/>
+          <w:szCs w:val="24"/>
+        </w:rPr>
+        <w:t>field.label</w:t>
       </w:r>
       <w:proofErr w:type="spellEnd"/>
       <w:r>
@@ -455,7 +394,6 @@
               <w:t xml:space="preserve"> for column in </w:t>
             </w:r>
             <w:proofErr w:type="spellStart"/>
-            <w:proofErr w:type="gramStart"/>
             <w:r>
               <w:rPr>
                 <w:rFonts w:ascii="Arial" w:eastAsia="Calibri" w:hAnsi="Arial" w:cs="Arial"/>
@@ -466,7 +404,6 @@
               <w:t>field.columns</w:t>
             </w:r>
             <w:proofErr w:type="spellEnd"/>
-            <w:proofErr w:type="gramEnd"/>
             <w:r>
               <w:rPr>
                 <w:rFonts w:ascii="Arial" w:eastAsia="Calibri" w:hAnsi="Arial" w:cs="Arial"/>
@@ -492,7 +429,6 @@
                 <w:szCs w:val="24"/>
               </w:rPr>
             </w:pPr>
-            <w:proofErr w:type="gramStart"/>
             <w:r>
               <w:rPr>
                 <w:rFonts w:ascii="Arial" w:eastAsia="Calibri" w:hAnsi="Arial" w:cs="Arial"/>
@@ -500,17 +436,7 @@
                 <w:sz w:val="24"/>
                 <w:szCs w:val="24"/>
               </w:rPr>
-              <w:t>{{ label</w:t>
-            </w:r>
-            <w:proofErr w:type="gramEnd"/>
-            <w:r>
-              <w:rPr>
-                <w:rFonts w:ascii="Arial" w:eastAsia="Calibri" w:hAnsi="Arial" w:cs="Arial"/>
-                <w:b/>
-                <w:sz w:val="24"/>
-                <w:szCs w:val="24"/>
-              </w:rPr>
-              <w:t>(column).capitalize()</w:t>
+              <w:t>{{ label(column).capitalize()</w:t>
             </w:r>
             <w:r>
               <w:rPr>
@@ -621,23 +547,13 @@
               <w:t xml:space="preserve">{%tr for row in </w:t>
             </w:r>
             <w:proofErr w:type="spellStart"/>
-            <w:proofErr w:type="gramStart"/>
-            <w:r>
-              <w:rPr>
-                <w:rFonts w:ascii="Arial" w:eastAsia="Calibri" w:hAnsi="Arial" w:cs="Arial"/>
-                <w:sz w:val="24"/>
-                <w:szCs w:val="24"/>
-              </w:rPr>
-              <w:t>field.overflow</w:t>
-            </w:r>
-            <w:proofErr w:type="gramEnd"/>
-            <w:r>
-              <w:rPr>
-                <w:rFonts w:ascii="Arial" w:eastAsia="Calibri" w:hAnsi="Arial" w:cs="Arial"/>
-                <w:sz w:val="24"/>
-                <w:szCs w:val="24"/>
-              </w:rPr>
-              <w:t>_value</w:t>
+            <w:r>
+              <w:rPr>
+                <w:rFonts w:ascii="Arial" w:eastAsia="Calibri" w:hAnsi="Arial" w:cs="Arial"/>
+                <w:sz w:val="24"/>
+                <w:szCs w:val="24"/>
+              </w:rPr>
+              <w:t>field.overflow_value</w:t>
             </w:r>
             <w:proofErr w:type="spellEnd"/>
             <w:r>
@@ -722,7 +638,6 @@
               <w:t xml:space="preserve"> for column in </w:t>
             </w:r>
             <w:proofErr w:type="spellStart"/>
-            <w:proofErr w:type="gramStart"/>
             <w:r>
               <w:rPr>
                 <w:rFonts w:ascii="Arial" w:eastAsia="Calibri" w:hAnsi="Arial" w:cs="Arial"/>
@@ -732,7 +647,6 @@
               <w:t>field.columns</w:t>
             </w:r>
             <w:proofErr w:type="spellEnd"/>
-            <w:proofErr w:type="gramEnd"/>
             <w:r>
               <w:rPr>
                 <w:rFonts w:ascii="Arial" w:eastAsia="Calibri" w:hAnsi="Arial" w:cs="Arial"/>
@@ -756,7 +670,6 @@
                 <w:szCs w:val="24"/>
               </w:rPr>
             </w:pPr>
-            <w:proofErr w:type="gramStart"/>
             <w:r>
               <w:rPr>
                 <w:rFonts w:ascii="Arial" w:eastAsia="Calibri" w:hAnsi="Arial" w:cs="Arial"/>
@@ -775,7 +688,6 @@
               <w:t>safeattr</w:t>
             </w:r>
             <w:proofErr w:type="spellEnd"/>
-            <w:proofErr w:type="gramEnd"/>
             <w:r>
               <w:rPr>
                 <w:rFonts w:ascii="Arial" w:eastAsia="Calibri" w:hAnsi="Arial" w:cs="Arial"/>
@@ -987,16 +899,7 @@
           <w:sz w:val="24"/>
           <w:szCs w:val="24"/>
         </w:rPr>
-        <w:t>field.is_</w:t>
-      </w:r>
-      <w:proofErr w:type="gramStart"/>
-      <w:r>
-        <w:rPr>
-          <w:rFonts w:ascii="Arial" w:hAnsi="Arial" w:cs="Arial"/>
-          <w:sz w:val="24"/>
-          <w:szCs w:val="24"/>
-        </w:rPr>
-        <w:t>list</w:t>
+        <w:t>field.is_list</w:t>
       </w:r>
       <w:proofErr w:type="spellEnd"/>
       <w:r>
@@ -1005,16 +908,7 @@
           <w:sz w:val="24"/>
           <w:szCs w:val="24"/>
         </w:rPr>
-        <w:t>(</w:t>
-      </w:r>
-      <w:proofErr w:type="gramEnd"/>
-      <w:r>
-        <w:rPr>
-          <w:rFonts w:ascii="Arial" w:hAnsi="Arial" w:cs="Arial"/>
-          <w:sz w:val="24"/>
-          <w:szCs w:val="24"/>
-        </w:rPr>
-        <w:t>) %}</w:t>
+        <w:t>() %}</w:t>
       </w:r>
     </w:p>
     <w:p>
@@ -1025,7 +919,6 @@
           <w:szCs w:val="24"/>
         </w:rPr>
       </w:pPr>
-      <w:proofErr w:type="gramStart"/>
       <w:r>
         <w:rPr>
           <w:sz w:val="24"/>
@@ -1039,15 +932,7 @@
           <w:sz w:val="24"/>
           <w:szCs w:val="24"/>
         </w:rPr>
-        <w:t>field</w:t>
-      </w:r>
-      <w:proofErr w:type="gramEnd"/>
-      <w:r>
-        <w:rPr>
-          <w:sz w:val="24"/>
-          <w:szCs w:val="24"/>
-        </w:rPr>
-        <w:t>.label</w:t>
+        <w:t>field.label</w:t>
       </w:r>
       <w:proofErr w:type="spellEnd"/>
       <w:r>
@@ -1080,23 +965,13 @@
         <w:t xml:space="preserve">{%p for item in </w:t>
       </w:r>
       <w:proofErr w:type="spellStart"/>
-      <w:proofErr w:type="gramStart"/>
-      <w:r>
-        <w:rPr>
-          <w:rFonts w:ascii="Arial" w:hAnsi="Arial" w:cs="Arial"/>
-          <w:sz w:val="24"/>
-          <w:szCs w:val="24"/>
-        </w:rPr>
-        <w:t>field.overflow</w:t>
-      </w:r>
-      <w:proofErr w:type="gramEnd"/>
-      <w:r>
-        <w:rPr>
-          <w:rFonts w:ascii="Arial" w:hAnsi="Arial" w:cs="Arial"/>
-          <w:sz w:val="24"/>
-          <w:szCs w:val="24"/>
-        </w:rPr>
-        <w:t>_value</w:t>
+      <w:r>
+        <w:rPr>
+          <w:rFonts w:ascii="Arial" w:hAnsi="Arial" w:cs="Arial"/>
+          <w:sz w:val="24"/>
+          <w:szCs w:val="24"/>
+        </w:rPr>
+        <w:t>field.overflow_value</w:t>
       </w:r>
       <w:proofErr w:type="spellEnd"/>
       <w:r>
@@ -1121,23 +996,13 @@
           <w:szCs w:val="24"/>
         </w:rPr>
       </w:pPr>
-      <w:proofErr w:type="gramStart"/>
-      <w:r>
-        <w:rPr>
-          <w:rFonts w:ascii="Arial" w:hAnsi="Arial" w:cs="Arial"/>
-          <w:sz w:val="24"/>
-          <w:szCs w:val="24"/>
-        </w:rPr>
-        <w:t>{{ item</w:t>
-      </w:r>
-      <w:proofErr w:type="gramEnd"/>
-      <w:r>
-        <w:rPr>
-          <w:rFonts w:ascii="Arial" w:hAnsi="Arial" w:cs="Arial"/>
-          <w:sz w:val="24"/>
-          <w:szCs w:val="24"/>
-        </w:rPr>
-        <w:t xml:space="preserve"> }}</w:t>
+      <w:r>
+        <w:rPr>
+          <w:rFonts w:ascii="Arial" w:hAnsi="Arial" w:cs="Arial"/>
+          <w:sz w:val="24"/>
+          <w:szCs w:val="24"/>
+        </w:rPr>
+        <w:t>{{ item }}</w:t>
       </w:r>
     </w:p>
     <w:p>
@@ -1205,7 +1070,6 @@
           <w:szCs w:val="24"/>
         </w:rPr>
       </w:pPr>
-      <w:proofErr w:type="gramStart"/>
       <w:r>
         <w:rPr>
           <w:sz w:val="24"/>
@@ -1219,15 +1083,7 @@
           <w:sz w:val="24"/>
           <w:szCs w:val="24"/>
         </w:rPr>
-        <w:t>field</w:t>
-      </w:r>
-      <w:proofErr w:type="gramEnd"/>
-      <w:r>
-        <w:rPr>
-          <w:sz w:val="24"/>
-          <w:szCs w:val="24"/>
-        </w:rPr>
-        <w:t>.label</w:t>
+        <w:t>field.label</w:t>
       </w:r>
       <w:proofErr w:type="spellEnd"/>
       <w:r>
@@ -1246,7 +1102,6 @@
           <w:szCs w:val="24"/>
         </w:rPr>
       </w:pPr>
-      <w:proofErr w:type="gramStart"/>
       <w:r>
         <w:rPr>
           <w:rFonts w:ascii="Arial" w:hAnsi="Arial" w:cs="Arial"/>
@@ -1262,16 +1117,7 @@
           <w:sz w:val="24"/>
           <w:szCs w:val="24"/>
         </w:rPr>
-        <w:t>field</w:t>
-      </w:r>
-      <w:proofErr w:type="gramEnd"/>
-      <w:r>
-        <w:rPr>
-          <w:rFonts w:ascii="Arial" w:hAnsi="Arial" w:cs="Arial"/>
-          <w:sz w:val="24"/>
-          <w:szCs w:val="24"/>
-        </w:rPr>
-        <w:t>.overflow_value</w:t>
+        <w:t>field.overflow_value</w:t>
       </w:r>
       <w:proofErr w:type="spellEnd"/>
       <w:r>
@@ -2627,6 +2473,7 @@
     <w:basedOn w:val="DefaultParagraphFont"/>
     <w:link w:val="Heading3"/>
     <w:uiPriority w:val="9"/>
+    <w:qFormat/>
     <w:rsid w:val="004E2E62"/>
     <w:rPr>
       <w:rFonts w:ascii="Arial" w:eastAsiaTheme="majorEastAsia" w:hAnsi="Arial" w:cs="Arial"/>

</xml_diff>